<commit_message>
feat: 作业11.2 - code, doc
</commit_message>
<xml_diff>
--- a/人形机器人综合实践课(2025年1期)/十一、基于深度学习的目标检测/doc/作业11.1.docx
+++ b/人形机器人综合实践课(2025年1期)/十一、基于深度学习的目标检测/doc/作业11.1.docx
@@ -695,15 +695,7 @@
         </w:rPr>
       </w:pPr>
       <w:r>
-        <w:t xml:space="preserve">尝试执行至少 2 </w:t>
-      </w:r>
-      <w:proofErr w:type="gramStart"/>
-      <w:r>
-        <w:t>个</w:t>
-      </w:r>
-      <w:proofErr w:type="gramEnd"/>
-      <w:r>
-        <w:t>基础 Linux 命令，例如：</w:t>
+        <w:t>尝试执行至少 2 个基础 Linux 命令，例如：</w:t>
       </w:r>
     </w:p>
     <w:p>
@@ -959,6 +951,9 @@
           <w:numId w:val="5"/>
         </w:numPr>
         <w:jc w:val="both"/>
+        <w:rPr>
+          <w:rFonts w:hint="eastAsia"/>
+        </w:rPr>
       </w:pPr>
       <w:r>
         <w:t>yolo checks 运行成功截图 1 张；</w:t>
@@ -1020,6 +1015,9 @@
           <w:numId w:val="5"/>
         </w:numPr>
         <w:jc w:val="both"/>
+        <w:rPr>
+          <w:rFonts w:hint="eastAsia"/>
+        </w:rPr>
       </w:pPr>
       <w:r>
         <w:t>CLI 推理终端输出截图 1 张，能看到 1 person, 1 sports ball 或类似检测结果；</w:t>
@@ -1099,6 +1097,9 @@
         </w:rPr>
       </w:pPr>
       <w:r>
+        <w:rPr>
+          <w:noProof/>
+        </w:rPr>
         <w:drawing>
           <wp:inline distT="0" distB="0" distL="0" distR="0" wp14:anchorId="2F04D165" wp14:editId="0E60ABC5">
             <wp:extent cx="5274310" cy="3515995"/>
@@ -1238,6 +1239,7 @@
       <w:pPr>
         <w:jc w:val="both"/>
         <w:rPr>
+          <w:rFonts w:hint="eastAsia"/>
           <w:b/>
           <w:bCs/>
         </w:rPr>
@@ -1263,14 +1265,7 @@
           <w:rFonts w:hint="eastAsia"/>
           <w:szCs w:val="22"/>
         </w:rPr>
-        <w:t>yolo检测结果</w:t>
-      </w:r>
-      <w:r>
-        <w:rPr>
-          <w:rFonts w:hint="eastAsia"/>
-          <w:szCs w:val="22"/>
-        </w:rPr>
-        <w:t>汇总如下，</w:t>
+        <w:t>yolo检测结果汇总如下，</w:t>
       </w:r>
     </w:p>
     <w:tbl>
@@ -1879,6 +1874,7 @@
             <w:pPr>
               <w:jc w:val="both"/>
               <w:rPr>
+                <w:rFonts w:hint="eastAsia"/>
                 <w:sz w:val="18"/>
                 <w:szCs w:val="18"/>
               </w:rPr>
@@ -1908,6 +1904,7 @@
             <w:pPr>
               <w:jc w:val="both"/>
               <w:rPr>
+                <w:rFonts w:hint="eastAsia"/>
                 <w:noProof/>
               </w:rPr>
             </w:pPr>
@@ -1975,6 +1972,9 @@
           <w:numId w:val="6"/>
         </w:numPr>
         <w:jc w:val="both"/>
+        <w:rPr>
+          <w:rFonts w:hint="eastAsia"/>
+        </w:rPr>
       </w:pPr>
       <w:r>
         <w:t>哪些图片被识别成了 sports ball？对应置信度大约是多少？</w:t>
@@ -1985,6 +1985,7 @@
         <w:ind w:left="720"/>
         <w:jc w:val="both"/>
         <w:rPr>
+          <w:rFonts w:hint="eastAsia"/>
           <w:szCs w:val="22"/>
         </w:rPr>
       </w:pPr>
@@ -2096,6 +2097,9 @@
           <w:numId w:val="7"/>
         </w:numPr>
         <w:jc w:val="both"/>
+        <w:rPr>
+          <w:rFonts w:hint="eastAsia"/>
+        </w:rPr>
       </w:pPr>
       <w:r>
         <w:t>哪些图片没有识别出足球？哪些图片被识别成了其他类别？</w:t>
@@ -2157,6 +2161,9 @@
           <w:numId w:val="8"/>
         </w:numPr>
         <w:jc w:val="both"/>
+        <w:rPr>
+          <w:rFonts w:hint="eastAsia"/>
+        </w:rPr>
       </w:pPr>
       <w:r>
         <w:t>降低 conf 后，检测结果有什么变化？是更容易出现目标框，还是误检也变多？</w:t>
@@ -2176,119 +2183,62 @@
           <w:rFonts w:hint="eastAsia"/>
           <w:szCs w:val="22"/>
         </w:rPr>
-        <w:t>降低置信度后，更容易出现目标框，但</w:t>
-      </w:r>
-      <w:r>
-        <w:rPr>
-          <w:rFonts w:hint="eastAsia"/>
+        <w:t>降低置信度后，更容易出现目标框，但同时</w:t>
+      </w:r>
+      <w:r>
+        <w:rPr>
           <w:szCs w:val="22"/>
         </w:rPr>
-        <w:t>同时</w:t>
-      </w:r>
-      <w:r>
-        <w:rPr>
+        <w:t>误检</w:t>
+      </w:r>
+      <w:r>
+        <w:rPr>
+          <w:rFonts w:hint="eastAsia"/>
           <w:szCs w:val="22"/>
         </w:rPr>
-        <w:t>误检</w:t>
+        <w:t>变多</w:t>
       </w:r>
       <w:r>
         <w:rPr>
           <w:rFonts w:hint="eastAsia"/>
           <w:szCs w:val="22"/>
         </w:rPr>
-        <w:t>变多</w:t>
-      </w:r>
-      <w:r>
-        <w:rPr>
-          <w:rFonts w:hint="eastAsia"/>
+        <w:t>。比如，</w:t>
+      </w:r>
+      <w:r>
+        <w:rPr>
           <w:szCs w:val="22"/>
         </w:rPr>
-        <w:t>。比如，</w:t>
-      </w:r>
-      <w:r>
-        <w:rPr>
+        <w:t>soccer_indoor_floor.png</w:t>
+      </w:r>
+      <w:r>
+        <w:rPr>
+          <w:rFonts w:hint="eastAsia"/>
           <w:szCs w:val="22"/>
         </w:rPr>
-        <w:t>soccer_indoor_floor.png</w:t>
-      </w:r>
-      <w:r>
-        <w:rPr>
-          <w:rFonts w:hint="eastAsia"/>
+        <w:t>，将置信度设置为0.1后，仍未检测出足球，但误检出dining table；</w:t>
+      </w:r>
+      <w:r>
+        <w:rPr>
           <w:szCs w:val="22"/>
         </w:rPr>
-        <w:t>，将置信度设置为0.1后，仍未检测出足球，</w:t>
-      </w:r>
-      <w:proofErr w:type="gramStart"/>
+        <w:t>soccer_studio_closeup.png</w:t>
+      </w:r>
       <w:r>
         <w:rPr>
           <w:rFonts w:hint="eastAsia"/>
           <w:szCs w:val="22"/>
         </w:rPr>
-        <w:t>但误检出</w:t>
-      </w:r>
-      <w:proofErr w:type="gramEnd"/>
-      <w:r>
-        <w:rPr>
-          <w:rFonts w:hint="eastAsia"/>
-          <w:szCs w:val="22"/>
-        </w:rPr>
-        <w:t>dining table；</w:t>
-      </w:r>
-      <w:r>
-        <w:rPr>
-          <w:szCs w:val="22"/>
-        </w:rPr>
-        <w:t>soccer_studio_closeup.png</w:t>
-      </w:r>
-      <w:r>
-        <w:rPr>
-          <w:rFonts w:hint="eastAsia"/>
-          <w:szCs w:val="22"/>
-        </w:rPr>
-        <w:t>，将</w:t>
-      </w:r>
-      <w:r>
-        <w:rPr>
-          <w:rFonts w:hint="eastAsia"/>
-          <w:szCs w:val="22"/>
-        </w:rPr>
-        <w:t>置信度设置为0.</w:t>
-      </w:r>
-      <w:r>
-        <w:rPr>
-          <w:rFonts w:hint="eastAsia"/>
-          <w:szCs w:val="22"/>
-        </w:rPr>
-        <w:t>08</w:t>
-      </w:r>
-      <w:r>
-        <w:rPr>
-          <w:rFonts w:hint="eastAsia"/>
-          <w:szCs w:val="22"/>
-        </w:rPr>
-        <w:t>后，仍未检测出足球，</w:t>
-      </w:r>
-      <w:proofErr w:type="gramStart"/>
-      <w:r>
-        <w:rPr>
-          <w:rFonts w:hint="eastAsia"/>
-          <w:szCs w:val="22"/>
-        </w:rPr>
-        <w:t>但误检出</w:t>
-      </w:r>
-      <w:proofErr w:type="gramEnd"/>
-      <w:r>
-        <w:rPr>
-          <w:rFonts w:hint="eastAsia"/>
-          <w:szCs w:val="22"/>
-        </w:rPr>
-        <w:t>toilet和mouse。</w:t>
+        <w:t>，将置信度设置为0.08后，仍未检测出足球，但误检出toilet和mouse。</w:t>
       </w:r>
     </w:p>
     <w:p>
       <w:pPr>
         <w:ind w:left="720"/>
         <w:jc w:val="both"/>
+        <w:rPr>
+          <w:rFonts w:hint="eastAsia"/>
+        </w:rPr>
       </w:pPr>
       <w:r>
         <w:rPr>
@@ -2379,6 +2329,9 @@
           <w:numId w:val="9"/>
         </w:numPr>
         <w:jc w:val="both"/>
+        <w:rPr>
+          <w:rFonts w:hint="eastAsia"/>
+        </w:rPr>
       </w:pPr>
       <w:r>
         <w:t>比较 soccer_practice_field.png 和 color_ball_clean.png，它们在背景、纹理、上下文上有什么不同？</w:t>
@@ -2406,17 +2359,12 @@
           <w:numId w:val="10"/>
         </w:numPr>
         <w:jc w:val="both"/>
-      </w:pPr>
-      <w:r>
-        <w:t>为什么同样是“球”，</w:t>
-      </w:r>
-      <w:proofErr w:type="gramStart"/>
-      <w:r>
-        <w:t>预训练</w:t>
-      </w:r>
-      <w:proofErr w:type="gramEnd"/>
-      <w:r>
-        <w:t xml:space="preserve"> YOLO 对不同图片的识别稳定性会不同？</w:t>
+        <w:rPr>
+          <w:rFonts w:hint="eastAsia"/>
+        </w:rPr>
+      </w:pPr>
+      <w:r>
+        <w:t>为什么同样是“球”，预训练 YOLO 对不同图片的识别稳定性会不同？</w:t>
       </w:r>
     </w:p>
     <w:p>
@@ -2428,42 +2376,18 @@
           <w:szCs w:val="22"/>
         </w:rPr>
       </w:pPr>
-      <w:proofErr w:type="gramStart"/>
       <w:r>
         <w:rPr>
           <w:szCs w:val="22"/>
         </w:rPr>
-        <w:t>预训练</w:t>
-      </w:r>
-      <w:proofErr w:type="gramEnd"/>
-      <w:r>
-        <w:rPr>
+        <w:t>预训练YOLO</w:t>
+      </w:r>
+      <w:r>
+        <w:rPr>
+          <w:rFonts w:hint="eastAsia"/>
           <w:szCs w:val="22"/>
         </w:rPr>
-        <w:t>YOLO</w:t>
-      </w:r>
-      <w:r>
-        <w:rPr>
-          <w:rFonts w:hint="eastAsia"/>
-          <w:szCs w:val="22"/>
-        </w:rPr>
-        <w:t>得到的yolo11n.pt权重文件，同训练时使用的训练数据相关。当训练数据中几乎</w:t>
-      </w:r>
-      <w:proofErr w:type="gramStart"/>
-      <w:r>
-        <w:rPr>
-          <w:rFonts w:hint="eastAsia"/>
-          <w:szCs w:val="22"/>
-        </w:rPr>
-        <w:t>不</w:t>
-      </w:r>
-      <w:proofErr w:type="gramEnd"/>
-      <w:r>
-        <w:rPr>
-          <w:rFonts w:hint="eastAsia"/>
-          <w:szCs w:val="22"/>
-        </w:rPr>
-        <w:t>含有类似</w:t>
+        <w:t>得到的yolo11n.pt权重文件，同训练时使用的训练数据相关。当训练数据中几乎不含有类似</w:t>
       </w:r>
       <w:r>
         <w:rPr>
@@ -2529,6 +2453,9 @@
           <w:numId w:val="11"/>
         </w:numPr>
         <w:jc w:val="both"/>
+        <w:rPr>
+          <w:rFonts w:hint="eastAsia"/>
+        </w:rPr>
       </w:pPr>
       <w:proofErr w:type="spellStart"/>
       <w:r>
@@ -2583,31 +2510,7 @@
         <w:rPr>
           <w:rFonts w:hint="eastAsia"/>
         </w:rPr>
-        <w:t>（</w:t>
-      </w:r>
-      <w:r>
-        <w:rPr>
-          <w:rFonts w:hint="eastAsia"/>
-        </w:rPr>
-        <w:t>class id =</w:t>
-      </w:r>
-      <w:r>
-        <w:rPr>
-          <w:rFonts w:hint="eastAsia"/>
-        </w:rPr>
-        <w:t xml:space="preserve"> </w:t>
-      </w:r>
-      <w:r>
-        <w:rPr>
-          <w:rFonts w:hint="eastAsia"/>
-        </w:rPr>
-        <w:t>32</w:t>
-      </w:r>
-      <w:r>
-        <w:rPr>
-          <w:rFonts w:hint="eastAsia"/>
-        </w:rPr>
-        <w:t>）。</w:t>
+        <w:t>（class id = 32）。</w:t>
       </w:r>
     </w:p>
     <w:p>
@@ -2666,17 +2569,12 @@
           <w:numId w:val="12"/>
         </w:numPr>
         <w:jc w:val="both"/>
-      </w:pPr>
-      <w:r>
-        <w:t>confidence 表示什么？置信度</w:t>
-      </w:r>
-      <w:proofErr w:type="gramStart"/>
-      <w:r>
-        <w:t>高是否</w:t>
-      </w:r>
-      <w:proofErr w:type="gramEnd"/>
-      <w:r>
-        <w:t>一定代表检测结果完全正确？</w:t>
+        <w:rPr>
+          <w:rFonts w:hint="eastAsia"/>
+        </w:rPr>
+      </w:pPr>
+      <w:r>
+        <w:t>confidence 表示什么？置信度高是否一定代表检测结果完全正确？</w:t>
       </w:r>
     </w:p>
     <w:p>
@@ -2749,6 +2647,9 @@
           <w:numId w:val="13"/>
         </w:numPr>
         <w:jc w:val="both"/>
+        <w:rPr>
+          <w:rFonts w:hint="eastAsia"/>
+        </w:rPr>
       </w:pPr>
       <w:proofErr w:type="spellStart"/>
       <w:r>
@@ -2780,13 +2681,7 @@
         <w:rPr>
           <w:rFonts w:hint="eastAsia"/>
         </w:rPr>
-        <w:t>)代表检测框的左上角坐标，</w:t>
-      </w:r>
-      <w:r>
-        <w:rPr>
-          <w:rFonts w:hint="eastAsia"/>
-        </w:rPr>
-        <w:t>(</w:t>
+        <w:t>)代表检测框的左上角坐标，(</w:t>
       </w:r>
       <w:r>
         <w:t>x</w:t>
@@ -2804,31 +2699,7 @@
         <w:rPr>
           <w:rFonts w:hint="eastAsia"/>
         </w:rPr>
-        <w:t>2</w:t>
-      </w:r>
-      <w:r>
-        <w:rPr>
-          <w:rFonts w:hint="eastAsia"/>
-        </w:rPr>
-        <w:t>)代表检测框的</w:t>
-      </w:r>
-      <w:r>
-        <w:rPr>
-          <w:rFonts w:hint="eastAsia"/>
-        </w:rPr>
-        <w:t>右</w:t>
-      </w:r>
-      <w:r>
-        <w:rPr>
-          <w:rFonts w:hint="eastAsia"/>
-        </w:rPr>
-        <w:t>上角坐标</w:t>
-      </w:r>
-      <w:r>
-        <w:rPr>
-          <w:rFonts w:hint="eastAsia"/>
-        </w:rPr>
-        <w:t>。</w:t>
+        <w:t>2)代表检测框的右上角坐标。</w:t>
       </w:r>
     </w:p>
     <w:p>
@@ -2838,6 +2709,9 @@
           <w:numId w:val="14"/>
         </w:numPr>
         <w:jc w:val="both"/>
+        <w:rPr>
+          <w:rFonts w:hint="eastAsia"/>
+        </w:rPr>
       </w:pPr>
       <w:r>
         <w:t>CLI 输出中的 preprocess、inference、postprocess 分别表示什么阶段？</w:t>
@@ -2874,6 +2748,9 @@
       <w:pPr>
         <w:ind w:left="720"/>
         <w:jc w:val="both"/>
+        <w:rPr>
+          <w:rFonts w:hint="eastAsia"/>
+        </w:rPr>
       </w:pPr>
       <w:r>
         <w:t>inference</w:t>
@@ -2909,43 +2786,7 @@
         <w:rPr>
           <w:rFonts w:hint="eastAsia"/>
         </w:rPr>
-        <w:t>：后处理。用于将yolo输出转换成可用结果，比如</w:t>
-      </w:r>
-      <w:r>
-        <w:rPr>
-          <w:rFonts w:hint="eastAsia"/>
-        </w:rPr>
-        <w:t>按</w:t>
-      </w:r>
-      <w:r>
-        <w:rPr>
-          <w:rFonts w:hint="eastAsia"/>
-        </w:rPr>
-        <w:t>置信度</w:t>
-      </w:r>
-      <w:r>
-        <w:rPr>
-          <w:rFonts w:hint="eastAsia"/>
-        </w:rPr>
-        <w:t>阈值过滤低置信度框</w:t>
-      </w:r>
-      <w:r>
-        <w:rPr>
-          <w:rFonts w:hint="eastAsia"/>
-        </w:rPr>
-        <w:t>、</w:t>
-      </w:r>
-      <w:r>
-        <w:rPr>
-          <w:rFonts w:hint="eastAsia"/>
-        </w:rPr>
-        <w:t>执行NMS去重</w:t>
-      </w:r>
-      <w:r>
-        <w:rPr>
-          <w:rFonts w:hint="eastAsia"/>
-        </w:rPr>
-        <w:t>等。</w:t>
+        <w:t>：后处理。用于将yolo输出转换成可用结果，比如按置信度阈值过滤低置信度框、执行NMS去重等。</w:t>
       </w:r>
     </w:p>
     <w:p>
@@ -2955,6 +2796,9 @@
           <w:numId w:val="15"/>
         </w:numPr>
         <w:jc w:val="both"/>
+        <w:rPr>
+          <w:rFonts w:hint="eastAsia"/>
+        </w:rPr>
       </w:pPr>
       <w:r>
         <w:t>NMS 的作用是什么？为什么一个目标可能会先产生多个候选框，最后只保留一个框？</w:t>
@@ -2964,6 +2808,9 @@
       <w:pPr>
         <w:ind w:left="720"/>
         <w:jc w:val="both"/>
+        <w:rPr>
+          <w:rFonts w:hint="eastAsia"/>
+        </w:rPr>
       </w:pPr>
       <w:r>
         <w:rPr>
@@ -2975,19 +2822,7 @@
         <w:rPr>
           <w:rFonts w:hint="eastAsia"/>
         </w:rPr>
-        <w:t>NMS（</w:t>
-      </w:r>
-      <w:r>
-        <w:rPr>
-          <w:rFonts w:hint="eastAsia"/>
-        </w:rPr>
-        <w:t>Non-Maximum Suppression</w:t>
-      </w:r>
-      <w:r>
-        <w:rPr>
-          <w:rFonts w:hint="eastAsia"/>
-        </w:rPr>
-        <w:t>）用于去除指向同一目标的重复检测框，最终保留置信度最高的。</w:t>
+        <w:t>NMS（Non-Maximum Suppression）用于去除指向同一目标的重复检测框，最终保留置信度最高的。</w:t>
       </w:r>
     </w:p>
     <w:p>
@@ -3020,13 +2855,7 @@
         <w:rPr>
           <w:rFonts w:hint="eastAsia"/>
         </w:rPr>
-        <w:t>时，很容易出现每个网格</w:t>
-      </w:r>
-      <w:r>
-        <w:rPr>
-          <w:rFonts w:hint="eastAsia"/>
-        </w:rPr>
-        <w:t>各自</w:t>
+        <w:t>时，很容易出现每个网格各自</w:t>
       </w:r>
       <w:r>
         <w:rPr>
@@ -3038,19 +2867,7 @@
         <w:rPr>
           <w:rFonts w:hint="eastAsia"/>
         </w:rPr>
-        <w:t>出一个高置信度的框，</w:t>
-      </w:r>
-      <w:r>
-        <w:rPr>
-          <w:rFonts w:hint="eastAsia"/>
-        </w:rPr>
-        <w:t>导致</w:t>
-      </w:r>
-      <w:r>
-        <w:rPr>
-          <w:rFonts w:hint="eastAsia"/>
-        </w:rPr>
-        <w:t>互相重叠。</w:t>
+        <w:t>出一个高置信度的框，导致互相重叠。</w:t>
       </w:r>
     </w:p>
     <w:p>
@@ -3077,6 +2894,9 @@
           <w:numId w:val="20"/>
         </w:numPr>
         <w:jc w:val="both"/>
+        <w:rPr>
+          <w:rFonts w:hint="eastAsia"/>
+        </w:rPr>
       </w:pPr>
       <w:r>
         <w:t>SSH 连接成功截图 1 张；</w:t>
@@ -3096,9 +2916,14 @@
         </w:rPr>
         <w:t>参见</w:t>
       </w:r>
-      <w:r>
-        <w:t>SSH连接Aelos机器人</w:t>
-      </w:r>
+      <w:hyperlink r:id="rId18" w:history="1">
+        <w:r>
+          <w:rPr>
+            <w:rStyle w:val="af"/>
+          </w:rPr>
+          <w:t>SSH连接Aelos机器人</w:t>
+        </w:r>
+      </w:hyperlink>
     </w:p>
     <w:p>
       <w:pPr>
@@ -3107,6 +2932,9 @@
           <w:numId w:val="20"/>
         </w:numPr>
         <w:jc w:val="both"/>
+        <w:rPr>
+          <w:rFonts w:hint="eastAsia"/>
+        </w:rPr>
       </w:pPr>
       <w:r>
         <w:t>通过 SSH 查看机器人文件目录的截图 1 张；</w:t>
@@ -3126,9 +2954,14 @@
         </w:rPr>
         <w:t>参见</w:t>
       </w:r>
-      <w:r>
-        <w:t>SSH查看机器人</w:t>
-      </w:r>
+      <w:hyperlink r:id="rId19" w:history="1">
+        <w:r>
+          <w:rPr>
+            <w:rStyle w:val="af"/>
+          </w:rPr>
+          <w:t>SSH查看机器人</w:t>
+        </w:r>
+      </w:hyperlink>
     </w:p>
     <w:p>
       <w:pPr>
@@ -3137,6 +2970,9 @@
           <w:numId w:val="20"/>
         </w:numPr>
         <w:jc w:val="both"/>
+        <w:rPr>
+          <w:rFonts w:hint="eastAsia"/>
+        </w:rPr>
       </w:pPr>
       <w:r>
         <w:t>简短文字说明：SSH 在机器人调试中的作用。</w:t>
@@ -5630,6 +5466,7 @@
   <w:style w:type="character" w:default="1" w:styleId="a0">
     <w:name w:val="Default Paragraph Font"/>
     <w:uiPriority w:val="1"/>
+    <w:semiHidden/>
     <w:unhideWhenUsed/>
   </w:style>
   <w:style w:type="table" w:default="1" w:styleId="a1">
@@ -5965,6 +5802,41 @@
       </w:tblBorders>
     </w:tblPr>
   </w:style>
+  <w:style w:type="character" w:styleId="af">
+    <w:name w:val="Hyperlink"/>
+    <w:basedOn w:val="a0"/>
+    <w:uiPriority w:val="99"/>
+    <w:unhideWhenUsed/>
+    <w:rsid w:val="00D75E02"/>
+    <w:rPr>
+      <w:color w:val="467886" w:themeColor="hyperlink"/>
+      <w:u w:val="single"/>
+    </w:rPr>
+  </w:style>
+  <w:style w:type="character" w:styleId="af0">
+    <w:name w:val="Unresolved Mention"/>
+    <w:basedOn w:val="a0"/>
+    <w:uiPriority w:val="99"/>
+    <w:semiHidden/>
+    <w:unhideWhenUsed/>
+    <w:rsid w:val="00D75E02"/>
+    <w:rPr>
+      <w:color w:val="605E5C"/>
+      <w:shd w:val="clear" w:color="auto" w:fill="E1DFDD"/>
+    </w:rPr>
+  </w:style>
+  <w:style w:type="character" w:styleId="af1">
+    <w:name w:val="FollowedHyperlink"/>
+    <w:basedOn w:val="a0"/>
+    <w:uiPriority w:val="99"/>
+    <w:semiHidden/>
+    <w:unhideWhenUsed/>
+    <w:rsid w:val="00C44688"/>
+    <w:rPr>
+      <w:color w:val="96607D" w:themeColor="followedHyperlink"/>
+      <w:u w:val="single"/>
+    </w:rPr>
+  </w:style>
 </w:styles>
 </file>
 

</xml_diff>